<commit_message>
Enrich MO disability/IME list with verified contacts; add CSV + DDS fix
- Folded researched provider-onboarding contacts (URLs, phones, emails)
  into the Excel; added Provider/join URL, Phone, Email columns.
- Applied corrections: MO DDS under DESE Voc Rehab; IMX now Leidos QTC;
  MATA matanet.org; Legion missourilegion.org; Sterling sterlingmedcorp.com;
  mdexams -> MDSI.
- Corrected DDS reference in outreach packet Template B.
- Added CSV export used to create the Google Sheet copy in Drive.

https://claude.ai/code/session_01UPpefrjLvassqcshMe3M2N
</commit_message>
<xml_diff>
--- a/GFM_Missouri_Disability_IME_Outreach_Packet.docx
+++ b/GFM_Missouri_Disability_IME_Outreach_Packet.docx
@@ -237,12 +237,12 @@
     </w:p>
     <w:p>
       <w:r>
-        <w:t>I'd like to inquire about enrolling Garcia Family Medicine as a Consultative Examination provider for Missouri Disability Determination Services. Dr. Tess Garcia is a dual board-certified physician with 26+ years of experience, located in Blue Springs (Jackson County), with capacity for adult physical and mental status consultative exams.</w:t>
+        <w:t>I'd like to inquire about enrolling Garcia Family Medicine as a Consultative Examination provider for Missouri Disability Determination Services (DDS, administered through the Department of Elementary &amp; Secondary Education / Vocational Rehabilitation). Dr. Tess Garcia is a dual board-certified physician with 26+ years of experience, located in Blue Springs (Jackson County), with capacity for adult physical and mental status consultative exams.</w:t>
       </w:r>
     </w:p>
     <w:p>
       <w:r>
-        <w:t>Could you connect me with the Professional Relations Officer (or the correct contact) and share the CE provider application, fee schedule, and documentation requirements? We can offer prompt scheduling and timely, complete reports.</w:t>
+        <w:t>Could you connect me with the Professional Relations Officer and share the CE provider application, fee schedule, and documentation requirements? We can offer prompt scheduling and timely, complete reports.</w:t>
       </w:r>
     </w:p>
     <w:p>

</xml_diff>